<commit_message>
Redo all paper figures to Elsevier publication standard
Single/double-column widths (90/190 mm), Arial-metric sans serif at 7-8 pt,
bold panel letters instead of in-figure titles, consistent method colours
with marker shapes as secondary encoding, vector PDF with embedded fonts plus
600 dpi PNG/TIFF. Captions updated to (a)/(b) panel references; docx and
preview rebuilt.

Co-Authored-By: Claude Opus 5.5 <noreply@anthropic.com>
Claude-Session: https://claude.ai/code/session_015S4667fLxo6aga9FDstjDx
</commit_message>
<xml_diff>
--- a/docs/paper/manuscript.docx
+++ b/docs/paper/manuscript.docx
@@ -1174,7 +1174,7 @@
       <w:r>
         <w:drawing>
           <wp:inline>
-            <wp:extent cx="5334000" cy="2419870"/>
+            <wp:extent cx="5334000" cy="2062773"/>
             <wp:effectExtent b="0" l="0" r="0" t="0"/>
             <wp:docPr descr="" title="" id="25" name="Picture"/>
             <a:graphic>
@@ -1195,7 +1195,7 @@
                   <pic:spPr bwMode="auto">
                     <a:xfrm>
                       <a:off x="0" y="0"/>
-                      <a:ext cx="5334000" cy="2419870"/>
+                      <a:ext cx="5334000" cy="2062773"/>
                     </a:xfrm>
                     <a:prstGeom prst="rect">
                       <a:avLst/>
@@ -18243,7 +18243,7 @@
       <w:r>
         <w:drawing>
           <wp:inline>
-            <wp:extent cx="3067368" cy="2786014"/>
+            <wp:extent cx="2799682" cy="2709616"/>
             <wp:effectExtent b="0" l="0" r="0" t="0"/>
             <wp:docPr descr="" title="" id="41" name="Picture"/>
             <a:graphic>
@@ -18264,7 +18264,7 @@
                   <pic:spPr bwMode="auto">
                     <a:xfrm>
                       <a:off x="0" y="0"/>
-                      <a:ext cx="3067368" cy="2786014"/>
+                      <a:ext cx="2799682" cy="2709616"/>
                     </a:xfrm>
                     <a:prstGeom prst="rect">
                       <a:avLst/>
@@ -18298,7 +18298,7 @@
         <w:t xml:space="preserve"> </w:t>
       </w:r>
       <w:r>
-        <w:t xml:space="preserve">Theory-predicted versus simulated 0.9 quantile of the exact run score (m, log–log), one point per field, for the 45 E-low v2 and v3 fields of each regime (filled circles; theory without field-edge terms). The simulated value is the empirical 0.9 quantile of 200 independent runs on the field’s reference plan. Open circles show the 15 E-low v3 R3 fields with the field-edge terms of Theorem 3(b). Notice that the RTK regimes lie on the diagonal, that the DGPS points without edge terms scatter below it, and that the edge terms move them onto it. Data: results/lowdata_v2, results/lowdata_v3, results/lowdata_v3/check_boundary_R3.txt.</w:t>
+        <w:t xml:space="preserve">Theory-predicted versus simulated 0.9 quantile of the exact run score (m, log–log), one point per field, for the 45 E-low v2 and v3 fields of each regime (filled markers; theory without field-edge terms; shaded band ±10%). The simulated value is the empirical 0.9 quantile of 200 independent runs on the field’s reference plan. Open black triangles show the 15 E-low v3 R3 fields with the field-edge terms of Theorem 3(b). Notice that the RTK regimes lie on the diagonal, that the DGPS points without edge terms scatter below it, and that the edge terms move them onto it. Data: results/lowdata_v2, results/lowdata_v3, results/lowdata_v3/check_boundary_R3.txt.</w:t>
       </w:r>
     </w:p>
     <w:tbl>
@@ -19234,7 +19234,7 @@
       <w:r>
         <w:drawing>
           <wp:inline>
-            <wp:extent cx="5334000" cy="2662577"/>
+            <wp:extent cx="5334000" cy="2368589"/>
             <wp:effectExtent b="0" l="0" r="0" t="0"/>
             <wp:docPr descr="" title="" id="45" name="Picture"/>
             <a:graphic>
@@ -19255,7 +19255,7 @@
                   <pic:spPr bwMode="auto">
                     <a:xfrm>
                       <a:off x="0" y="0"/>
-                      <a:ext cx="5334000" cy="2662577"/>
+                      <a:ext cx="5334000" cy="2368589"/>
                     </a:xfrm>
                     <a:prstGeom prst="rect">
                       <a:avLst/>
@@ -19289,7 +19289,7 @@
         <w:t xml:space="preserve"> </w:t>
       </w:r>
       <w:r>
-        <w:t xml:space="preserve">Regret (main-area overlap above the per-field oracle, pp) of CE+ v8 and the two conformal planners on the 90 fresh fields of the v8 confirmatory comparison, for the marginal (left) and PAC (right) guarantee classes; bars are means over 30 fields, error bars 95% intervals, and the numbers above bars are pooled P(no miss). Notice that the comparators over-cover (P 0.92–0.99) within the same guarantee class while CE+ stays near its target, and that this over-coverage is what their extra overlap buys. Data: results/v8/system_v8.csv.</w:t>
+        <w:t xml:space="preserve">Regret (main-area overlap above the per-field oracle, pp) of CE+ v8 and the two conformal planners on the 90 fresh fields of the v8 confirmatory comparison, for the marginal (a) and PAC (b) guarantee classes; bars are means over 30 fields, error bars 95% intervals, and the numbers above bars are pooled P(no miss). Notice that the comparators over-cover (P 0.92–0.99) within the same guarantee class while CE+ stays near its target, and that this over-coverage is what their extra overlap buys. Data: results/v8/system_v8.csv.</w:t>
       </w:r>
     </w:p>
     <w:p>
@@ -20650,7 +20650,7 @@
       <w:r>
         <w:drawing>
           <wp:inline>
-            <wp:extent cx="5334000" cy="2117229"/>
+            <wp:extent cx="5334000" cy="2142402"/>
             <wp:effectExtent b="0" l="0" r="0" t="0"/>
             <wp:docPr descr="" title="" id="50" name="Picture"/>
             <a:graphic>
@@ -20671,7 +20671,7 @@
                   <pic:spPr bwMode="auto">
                     <a:xfrm>
                       <a:off x="0" y="0"/>
-                      <a:ext cx="5334000" cy="2117229"/>
+                      <a:ext cx="5334000" cy="2142402"/>
                     </a:xfrm>
                     <a:prstGeom prst="rect">
                       <a:avLst/>
@@ -20705,7 +20705,7 @@
         <w:t xml:space="preserve"> </w:t>
       </w:r>
       <w:r>
-        <w:t xml:space="preserve">Direct check of the coverage guarantee over both sources of randomness (pre-registered; 4000 replicates per point). Left: mean coverage of the marginal rule; right: share of replicates whose coverage reaches 0.9 under the PAC rule; dashed lines mark</w:t>
+        <w:t xml:space="preserve">Direct check of the coverage guarantee over both sources of randomness (pre-registered; 4000 replicates per point). (a) Mean coverage of the marginal rule (bars: 95% intervals); (b) share of replicates whose coverage reaches 0.9 under the PAC rule; dashed orange lines mark the registered criteria, 0.895 in (a) and</w:t>
       </w:r>
       <w:r>
         <w:t xml:space="preserve"> </w:t>
@@ -20721,6 +20721,47 @@
           <m:t>−</m:t>
         </m:r>
         <m:r>
+          <m:t>δ</m:t>
+        </m:r>
+        <m:r>
+          <m:rPr>
+            <m:sty m:val="p"/>
+          </m:rPr>
+          <m:t>−</m:t>
+        </m:r>
+        <m:r>
+          <m:t>0.02</m:t>
+        </m:r>
+        <m:r>
+          <m:rPr>
+            <m:sty m:val="p"/>
+          </m:rPr>
+          <m:t>=</m:t>
+        </m:r>
+        <m:r>
+          <m:t>0.88</m:t>
+        </m:r>
+      </m:oMath>
+      <w:r>
+        <w:t xml:space="preserve"> </w:t>
+      </w:r>
+      <w:r>
+        <w:t xml:space="preserve">in (b), and the shaded region is the invalid side; the dotted line in (a) marks</w:t>
+      </w:r>
+      <w:r>
+        <w:t xml:space="preserve"> </w:t>
+      </w:r>
+      <m:oMath>
+        <m:r>
+          <m:t>1</m:t>
+        </m:r>
+        <m:r>
+          <m:rPr>
+            <m:sty m:val="p"/>
+          </m:rPr>
+          <m:t>−</m:t>
+        </m:r>
+        <m:r>
           <m:t>ε</m:t>
         </m:r>
         <m:r>
@@ -20734,51 +20775,7 @@
         </m:r>
       </m:oMath>
       <w:r>
-        <w:t xml:space="preserve"> </w:t>
-      </w:r>
-      <w:r>
-        <w:t xml:space="preserve">(left; the registered criterion is 0.895) and</w:t>
-      </w:r>
-      <w:r>
-        <w:t xml:space="preserve"> </w:t>
-      </w:r>
-      <m:oMath>
-        <m:r>
-          <m:t>1</m:t>
-        </m:r>
-        <m:r>
-          <m:rPr>
-            <m:sty m:val="p"/>
-          </m:rPr>
-          <m:t>−</m:t>
-        </m:r>
-        <m:r>
-          <m:t>δ</m:t>
-        </m:r>
-        <m:r>
-          <m:rPr>
-            <m:sty m:val="p"/>
-          </m:rPr>
-          <m:t>−</m:t>
-        </m:r>
-        <m:r>
-          <m:t>0.02</m:t>
-        </m:r>
-        <m:r>
-          <m:rPr>
-            <m:sty m:val="p"/>
-          </m:rPr>
-          <m:t>=</m:t>
-        </m:r>
-        <m:r>
-          <m:t>0.88</m:t>
-        </m:r>
-      </m:oMath>
-      <w:r>
-        <w:t xml:space="preserve"> </w:t>
-      </w:r>
-      <w:r>
-        <w:t xml:space="preserve">(right). Colours are scale pivots (raw pooling, scale law, spec × scale law in the mixed fleet only, and the theory pivot of CE-EVT-R). Notice that all 26 points lie on the valid side, and that the pivots are indistinguishable in coverage, as the theorem predicts. Data: results/lowdata_v3/validity_resample_extended_curves.txt.</w:t>
+        <w:t xml:space="preserve">. Colours are scale pivots (raw pooling, scale law, spec × scale law in the mixed fleet only, and the theory pivot of CE-EVT-R). Notice that all 26 points lie on the valid side, and that the pivots are indistinguishable in coverage, as the theorem predicts. Data: results/lowdata_v3/validity_resample_extended_curves.txt.</w:t>
       </w:r>
     </w:p>
     <w:p>
@@ -21337,7 +21334,7 @@
       <w:r>
         <w:drawing>
           <wp:inline>
-            <wp:extent cx="5334000" cy="1707575"/>
+            <wp:extent cx="5334000" cy="1391199"/>
             <wp:effectExtent b="0" l="0" r="0" t="0"/>
             <wp:docPr descr="" title="" id="54" name="Picture"/>
             <a:graphic>
@@ -21358,7 +21355,7 @@
                   <pic:spPr bwMode="auto">
                     <a:xfrm>
                       <a:off x="0" y="0"/>
-                      <a:ext cx="5334000" cy="1707575"/>
+                      <a:ext cx="5334000" cy="1391199"/>
                     </a:xfrm>
                     <a:prstGeom prst="rect">
                       <a:avLst/>
@@ -21392,7 +21389,7 @@
         <w:t xml:space="preserve"> </w:t>
       </w:r>
       <w:r>
-        <w:t xml:space="preserve">Mean excess overlap (pp above the per-field oracle) of four scale pivots on a mixed fleet of three machine configurations (RTK 3 m, RTK 1.5 m, DGPS 6 m), averaged over 4000 resampling replicates with random 25-field calibration splits and redrawn historical runs; marginal (left) and PAC (right) rule. All four pivots are valid (Fig. 4); they differ only in efficiency. Notice that configuration-blind pivots (raw pooling, scale law) cost an order of magnitude more overlap than the theory pivot, and the vendor-specification scale recovers only part of the difference. Data: results/lowdata_v3/validity_resample_extended_curves.txt.</w:t>
+        <w:t xml:space="preserve">Mean excess overlap (pp above the per-field oracle) of four scale pivots on a mixed fleet of three machine configurations (RTK 3 m, RTK 1.5 m, DGPS 6 m), averaged over 4000 resampling replicates with random 25-field calibration splits and redrawn historical runs; marginal (a) and PAC (b) rule. All four pivots are valid (Fig. 4); they differ only in efficiency. Notice that configuration-blind pivots (raw pooling, scale law) cost an order of magnitude more overlap than the theory pivot, and the vendor-specification scale recovers only part of the difference. Data: results/lowdata_v3/validity_resample_extended_curves.txt.</w:t>
       </w:r>
     </w:p>
     <w:p>
@@ -22054,7 +22051,7 @@
       <w:r>
         <w:drawing>
           <wp:inline>
-            <wp:extent cx="5334000" cy="2375694"/>
+            <wp:extent cx="5334000" cy="2138143"/>
             <wp:effectExtent b="0" l="0" r="0" t="0"/>
             <wp:docPr descr="" title="" id="57" name="Picture"/>
             <a:graphic>
@@ -22075,7 +22072,7 @@
                   <pic:spPr bwMode="auto">
                     <a:xfrm>
                       <a:off x="0" y="0"/>
-                      <a:ext cx="5334000" cy="2375694"/>
+                      <a:ext cx="5334000" cy="2138143"/>
                     </a:xfrm>
                     <a:prstGeom prst="rect">
                       <a:avLst/>
@@ -22109,7 +22106,7 @@
         <w:t xml:space="preserve"> </w:t>
       </w:r>
       <w:r>
-        <w:t xml:space="preserve">Learning curves of field-feature predictors of the per-field required margin, compared with the zero-data theory, for each regime: standard deviation of log(predicted / true optimum) on the 30 E-low v2 test fields (log scale) against the number of training fields, mean over 40 random training subsets. Orange: ridge regression trained on one historical run per field (the data the low-data setting provides); green: the same regression trained on oracle targets that require hundreds of runs per field; blue line: the theory, which needs no run data. Notice that the one-run predictor never reaches the theory within the available pools, and that in R3 (DGPS) even oracle training does not. Data: results/lowdata_v2/feature_learning_curve.txt (post hoc).</w:t>
+        <w:t xml:space="preserve">Learning curves of field-feature predictors of the per-field required margin, compared with the zero-data theory, for regimes R1–R3 (a–c): standard deviation of log(predicted / true optimum) on the 30 E-low v2 test fields (log scale) against the number of training fields, mean over 40 random training subsets. Orange: ridge regression trained on one historical run per field (the data the low-data setting provides); green: the same regression trained on oracle targets that require hundreds of runs per field; blue line: the theory, which needs no run data. Notice that the one-run predictor never reaches the theory within the available pools, and that in R3 (DGPS) even oracle training does not. Data: results/lowdata_v2/feature_learning_curve.txt (post hoc).</w:t>
       </w:r>
     </w:p>
     <w:p>
@@ -22225,7 +22222,7 @@
       <w:r>
         <w:drawing>
           <wp:inline>
-            <wp:extent cx="3070426" cy="2067339"/>
+            <wp:extent cx="2941650" cy="1995193"/>
             <wp:effectExtent b="0" l="0" r="0" t="0"/>
             <wp:docPr descr="" title="" id="60" name="Picture"/>
             <a:graphic>
@@ -22246,7 +22243,7 @@
                   <pic:spPr bwMode="auto">
                     <a:xfrm>
                       <a:off x="0" y="0"/>
-                      <a:ext cx="3070426" cy="2067339"/>
+                      <a:ext cx="2941650" cy="1995193"/>
                     </a:xfrm>
                     <a:prstGeom prst="rect">
                       <a:avLst/>
@@ -22334,7 +22331,7 @@
         <w:t xml:space="preserve"> </w:t>
       </w:r>
       <w:r>
-        <w:t xml:space="preserve">calibration fields. Blue: prediction from the theory alone (mean ± standard deviation over 2000 simulated calibrations using the theory CDFs as run-score distributions); orange: value observed on the 30 fresh E-low v2 fields of each regime. Notice that all observations lie within one predicted standard deviation and that the heavier DGPS tail (R3) is predicted to, and does, give the largest inflation. Post hoc; data: docs/theory_limit.md, results/lowdata_v2/feature_pivot.txt.</w:t>
+        <w:t xml:space="preserve">calibration fields. Blue line and shaded box: prediction from the theory alone (mean ± standard deviation over 2000 simulated calibrations using the theory CDFs as run-score distributions); orange diamonds: value observed on the 30 fresh E-low v2 fields of each regime. Notice that all observations lie within one predicted standard deviation and that the heavier DGPS tail (R3) is predicted to, and does, give the largest inflation. Post hoc; data: docs/theory_limit.md, results/lowdata_v2/feature_pivot.txt.</w:t>
       </w:r>
     </w:p>
     <w:p>

</xml_diff>

<commit_message>
Consistent theorem numbering between manuscript and supplementary; cross-references fixed; docx/pdf rebuilt
Co-Authored-By: Claude Opus 5.5 <noreply@anthropic.com>
Claude-Session: https://claude.ai/code/session_015S4667fLxo6aga9FDstjDx
</commit_message>
<xml_diff>
--- a/docs/paper/manuscript.docx
+++ b/docs/paper/manuscript.docx
@@ -10491,7 +10491,7 @@
         <w:pStyle w:val="FirstParagraph"/>
       </w:pPr>
       <w:r>
-        <w:t xml:space="preserve">Fig. 2 compares the predicted 0.9 quantile of the run score on each field’s reference plan with the empirical 0.9 quantile of 200 independent simulated runs, on the 45 test fields of each configuration. The 200-run reference quantile is itself noisy; the Monte Carlo twin with 1000 fresh runs differs from it by a log standard deviation of 0.030 (R1), 0.032 (R2) and 0.083 (R3), which is essentially this sampling noise. The analytic model differs from it by 0.039, 0.038 and 0.097, with mean bias +1.0%, +0.1% and −5.2%; its own error, net of the reference noise, is therefore about 2–3% under RTK. Under DGPS, the model without field-edge terms was biased low; the edge terms (Theorem 3(b), Appendix A.12) were derived after this observation and remove the bias (+0.8% on the 15 fields on which they were developed; Appendix B.3). The analytic model needs 16–353 s per field and the twin a median of 8–21 s (Table S21), both once per field and offline.</w:t>
+        <w:t xml:space="preserve">Fig. 2 compares the predicted 0.9 quantile of the run score on each field’s reference plan with the empirical 0.9 quantile of 200 independent simulated runs, on the 45 test fields of each configuration. The 200-run reference quantile is itself noisy; the Monte Carlo twin with 1000 fresh runs differs from it by a log standard deviation of 0.030 (R1), 0.032 (R2) and 0.083 (R3), which is essentially this sampling noise. The analytic model differs from it by 0.039, 0.038 and 0.097, with mean bias +1.0%, +0.1% and −5.2%; its own error, net of the reference noise, is therefore about 2–3% under RTK. Under DGPS, the model without field-edge terms was biased low; the edge terms (Theorem A2(b), Appendix A.12) were derived after this observation and remove the bias (+0.8% on the 15 fields on which they were developed; Appendix B.3). The analytic model needs 16–353 s per field and the twin a median of 8–21 s (Table S21), both once per field and offline.</w:t>
       </w:r>
     </w:p>
     <w:p>
@@ -14050,7 +14050,7 @@
         <w:t xml:space="preserve"> </w:t>
       </w:r>
       <w:r>
-        <w:t xml:space="preserve">missed area. Table 8 and Fig. 5 evaluate it on the margin curves of the test fields (nominal model, descriptive).</w:t>
+        <w:t xml:space="preserve">missed area. Table 8 and Fig. 5 evaluate it on the margin curves of the 45 test fields of each configuration (nominal model, descriptive).</w:t>
       </w:r>
     </w:p>
     <w:tbl>
@@ -14279,67 +14279,67 @@
               <w:jc w:val="left"/>
             </w:pPr>
             <w:r>
-              <w:t xml:space="preserve">2.15</w:t>
-            </w:r>
-          </w:p>
-        </w:tc>
-        <w:tc>
-          <w:tcPr/>
-          <w:p>
-            <w:pPr>
-              <w:pStyle w:val="Compact"/>
-              <w:jc w:val="left"/>
-            </w:pPr>
-            <w:r>
-              <w:t xml:space="preserve">0.159</w:t>
-            </w:r>
-          </w:p>
-        </w:tc>
-        <w:tc>
-          <w:tcPr/>
-          <w:p>
-            <w:pPr>
-              <w:pStyle w:val="Compact"/>
-              <w:jc w:val="left"/>
-            </w:pPr>
-            <w:r>
-              <w:t xml:space="preserve">3.73</w:t>
-            </w:r>
-          </w:p>
-        </w:tc>
-        <w:tc>
-          <w:tcPr/>
-          <w:p>
-            <w:pPr>
-              <w:pStyle w:val="Compact"/>
-              <w:jc w:val="left"/>
-            </w:pPr>
-            <w:r>
-              <w:t xml:space="preserve">6.91</w:t>
-            </w:r>
-          </w:p>
-        </w:tc>
-        <w:tc>
-          <w:tcPr/>
-          <w:p>
-            <w:pPr>
-              <w:pStyle w:val="Compact"/>
-              <w:jc w:val="left"/>
-            </w:pPr>
-            <w:r>
-              <w:t xml:space="preserve">18.02</w:t>
-            </w:r>
-          </w:p>
-        </w:tc>
-        <w:tc>
-          <w:tcPr/>
-          <w:p>
-            <w:pPr>
-              <w:pStyle w:val="Compact"/>
-              <w:jc w:val="left"/>
-            </w:pPr>
-            <w:r>
-              <w:t xml:space="preserve">49.78</w:t>
+              <w:t xml:space="preserve">2.12</w:t>
+            </w:r>
+          </w:p>
+        </w:tc>
+        <w:tc>
+          <w:tcPr/>
+          <w:p>
+            <w:pPr>
+              <w:pStyle w:val="Compact"/>
+              <w:jc w:val="left"/>
+            </w:pPr>
+            <w:r>
+              <w:t xml:space="preserve">0.160</w:t>
+            </w:r>
+          </w:p>
+        </w:tc>
+        <w:tc>
+          <w:tcPr/>
+          <w:p>
+            <w:pPr>
+              <w:pStyle w:val="Compact"/>
+              <w:jc w:val="left"/>
+            </w:pPr>
+            <w:r>
+              <w:t xml:space="preserve">3.72</w:t>
+            </w:r>
+          </w:p>
+        </w:tc>
+        <w:tc>
+          <w:tcPr/>
+          <w:p>
+            <w:pPr>
+              <w:pStyle w:val="Compact"/>
+              <w:jc w:val="left"/>
+            </w:pPr>
+            <w:r>
+              <w:t xml:space="preserve">6.92</w:t>
+            </w:r>
+          </w:p>
+        </w:tc>
+        <w:tc>
+          <w:tcPr/>
+          <w:p>
+            <w:pPr>
+              <w:pStyle w:val="Compact"/>
+              <w:jc w:val="left"/>
+            </w:pPr>
+            <w:r>
+              <w:t xml:space="preserve">18.10</w:t>
+            </w:r>
+          </w:p>
+        </w:tc>
+        <w:tc>
+          <w:tcPr/>
+          <w:p>
+            <w:pPr>
+              <w:pStyle w:val="Compact"/>
+              <w:jc w:val="left"/>
+            </w:pPr>
+            <w:r>
+              <w:t xml:space="preserve">50.04</w:t>
             </w:r>
           </w:p>
         </w:tc>
@@ -14373,7 +14373,7 @@
               <w:jc w:val="left"/>
             </w:pPr>
             <w:r>
-              <w:t xml:space="preserve">0.879</w:t>
+              <w:t xml:space="preserve">0.882</w:t>
             </w:r>
           </w:p>
         </w:tc>
@@ -14433,19 +14433,19 @@
               <w:jc w:val="left"/>
             </w:pPr>
             <w:r>
-              <w:t xml:space="preserve">9.12</w:t>
-            </w:r>
-          </w:p>
-        </w:tc>
-        <w:tc>
-          <w:tcPr/>
-          <w:p>
-            <w:pPr>
-              <w:pStyle w:val="Compact"/>
-              <w:jc w:val="left"/>
-            </w:pPr>
-            <w:r>
-              <w:t xml:space="preserve">9.26</w:t>
+              <w:t xml:space="preserve">9.11</w:t>
+            </w:r>
+          </w:p>
+        </w:tc>
+        <w:tc>
+          <w:tcPr/>
+          <w:p>
+            <w:pPr>
+              <w:pStyle w:val="Compact"/>
+              <w:jc w:val="left"/>
+            </w:pPr>
+            <w:r>
+              <w:t xml:space="preserve">9.24</w:t>
             </w:r>
           </w:p>
         </w:tc>
@@ -14514,6 +14514,42 @@
               <w:jc w:val="left"/>
             </w:pPr>
             <w:r>
+              <w:t xml:space="preserve">8.91</w:t>
+            </w:r>
+          </w:p>
+        </w:tc>
+        <w:tc>
+          <w:tcPr/>
+          <w:p>
+            <w:pPr>
+              <w:pStyle w:val="Compact"/>
+              <w:jc w:val="left"/>
+            </w:pPr>
+            <w:r>
+              <w:t xml:space="preserve">0.001</w:t>
+            </w:r>
+          </w:p>
+        </w:tc>
+        <w:tc>
+          <w:tcPr/>
+          <w:p>
+            <w:pPr>
+              <w:pStyle w:val="Compact"/>
+              <w:jc w:val="left"/>
+            </w:pPr>
+            <w:r>
+              <w:t xml:space="preserve">8.92</w:t>
+            </w:r>
+          </w:p>
+        </w:tc>
+        <w:tc>
+          <w:tcPr/>
+          <w:p>
+            <w:pPr>
+              <w:pStyle w:val="Compact"/>
+              <w:jc w:val="left"/>
+            </w:pPr>
+            <w:r>
               <w:t xml:space="preserve">8.93</w:t>
             </w:r>
           </w:p>
@@ -14526,55 +14562,19 @@
               <w:jc w:val="left"/>
             </w:pPr>
             <w:r>
-              <w:t xml:space="preserve">0.001</w:t>
-            </w:r>
-          </w:p>
-        </w:tc>
-        <w:tc>
-          <w:tcPr/>
-          <w:p>
-            <w:pPr>
-              <w:pStyle w:val="Compact"/>
-              <w:jc w:val="left"/>
-            </w:pPr>
-            <w:r>
-              <w:t xml:space="preserve">8.94</w:t>
-            </w:r>
-          </w:p>
-        </w:tc>
-        <w:tc>
-          <w:tcPr/>
-          <w:p>
-            <w:pPr>
-              <w:pStyle w:val="Compact"/>
-              <w:jc w:val="left"/>
-            </w:pPr>
-            <w:r>
-              <w:t xml:space="preserve">8.95</w:t>
-            </w:r>
-          </w:p>
-        </w:tc>
-        <w:tc>
-          <w:tcPr/>
-          <w:p>
-            <w:pPr>
-              <w:pStyle w:val="Compact"/>
-              <w:jc w:val="left"/>
-            </w:pPr>
-            <w:r>
-              <w:t xml:space="preserve">9.00</w:t>
-            </w:r>
-          </w:p>
-        </w:tc>
-        <w:tc>
-          <w:tcPr/>
-          <w:p>
-            <w:pPr>
-              <w:pStyle w:val="Compact"/>
-              <w:jc w:val="left"/>
-            </w:pPr>
-            <w:r>
-              <w:t xml:space="preserve">9.13</w:t>
+              <w:t xml:space="preserve">8.98</w:t>
+            </w:r>
+          </w:p>
+        </w:tc>
+        <w:tc>
+          <w:tcPr/>
+          <w:p>
+            <w:pPr>
+              <w:pStyle w:val="Compact"/>
+              <w:jc w:val="left"/>
+            </w:pPr>
+            <w:r>
+              <w:t xml:space="preserve">9.11</w:t>
             </w:r>
           </w:p>
         </w:tc>
@@ -14608,7 +14608,7 @@
               <w:jc w:val="left"/>
             </w:pPr>
             <w:r>
-              <w:t xml:space="preserve">0.03–0.49</w:t>
+              <w:t xml:space="preserve">0.02–0.50</w:t>
             </w:r>
           </w:p>
         </w:tc>
@@ -14644,7 +14644,7 @@
                 <w:bCs/>
                 <w:b/>
               </w:rPr>
-              <w:t xml:space="preserve">3.57</w:t>
+              <w:t xml:space="preserve">3.54</w:t>
             </w:r>
           </w:p>
         </w:tc>
@@ -14660,7 +14660,7 @@
                 <w:bCs/>
                 <w:b/>
               </w:rPr>
-              <w:t xml:space="preserve">4.73</w:t>
+              <w:t xml:space="preserve">4.69</w:t>
             </w:r>
           </w:p>
         </w:tc>
@@ -14676,7 +14676,7 @@
                 <w:bCs/>
                 <w:b/>
               </w:rPr>
-              <w:t xml:space="preserve">5.93</w:t>
+              <w:t xml:space="preserve">5.92</w:t>
             </w:r>
           </w:p>
         </w:tc>
@@ -14692,7 +14692,7 @@
                 <w:bCs/>
                 <w:b/>
               </w:rPr>
-              <w:t xml:space="preserve">7.11</w:t>
+              <w:t xml:space="preserve">7.10</w:t>
             </w:r>
           </w:p>
         </w:tc>
@@ -14742,67 +14742,67 @@
               <w:jc w:val="left"/>
             </w:pPr>
             <w:r>
-              <w:t xml:space="preserve">5.39</w:t>
-            </w:r>
-          </w:p>
-        </w:tc>
-        <w:tc>
-          <w:tcPr/>
-          <w:p>
-            <w:pPr>
-              <w:pStyle w:val="Compact"/>
-              <w:jc w:val="left"/>
-            </w:pPr>
-            <w:r>
-              <w:t xml:space="preserve">0.340</w:t>
-            </w:r>
-          </w:p>
-        </w:tc>
-        <w:tc>
-          <w:tcPr/>
-          <w:p>
-            <w:pPr>
-              <w:pStyle w:val="Compact"/>
-              <w:jc w:val="left"/>
-            </w:pPr>
-            <w:r>
-              <w:t xml:space="preserve">8.78</w:t>
-            </w:r>
-          </w:p>
-        </w:tc>
-        <w:tc>
-          <w:tcPr/>
-          <w:p>
-            <w:pPr>
-              <w:pStyle w:val="Compact"/>
-              <w:jc w:val="left"/>
-            </w:pPr>
-            <w:r>
-              <w:t xml:space="preserve">15.58</w:t>
-            </w:r>
-          </w:p>
-        </w:tc>
-        <w:tc>
-          <w:tcPr/>
-          <w:p>
-            <w:pPr>
-              <w:pStyle w:val="Compact"/>
-              <w:jc w:val="left"/>
-            </w:pPr>
-            <w:r>
-              <w:t xml:space="preserve">39.36</w:t>
-            </w:r>
-          </w:p>
-        </w:tc>
-        <w:tc>
-          <w:tcPr/>
-          <w:p>
-            <w:pPr>
-              <w:pStyle w:val="Compact"/>
-              <w:jc w:val="left"/>
-            </w:pPr>
-            <w:r>
-              <w:t xml:space="preserve">107.32</w:t>
+              <w:t xml:space="preserve">5.38</w:t>
+            </w:r>
+          </w:p>
+        </w:tc>
+        <w:tc>
+          <w:tcPr/>
+          <w:p>
+            <w:pPr>
+              <w:pStyle w:val="Compact"/>
+              <w:jc w:val="left"/>
+            </w:pPr>
+            <w:r>
+              <w:t xml:space="preserve">0.336</w:t>
+            </w:r>
+          </w:p>
+        </w:tc>
+        <w:tc>
+          <w:tcPr/>
+          <w:p>
+            <w:pPr>
+              <w:pStyle w:val="Compact"/>
+              <w:jc w:val="left"/>
+            </w:pPr>
+            <w:r>
+              <w:t xml:space="preserve">8.74</w:t>
+            </w:r>
+          </w:p>
+        </w:tc>
+        <w:tc>
+          <w:tcPr/>
+          <w:p>
+            <w:pPr>
+              <w:pStyle w:val="Compact"/>
+              <w:jc w:val="left"/>
+            </w:pPr>
+            <w:r>
+              <w:t xml:space="preserve">15.45</w:t>
+            </w:r>
+          </w:p>
+        </w:tc>
+        <w:tc>
+          <w:tcPr/>
+          <w:p>
+            <w:pPr>
+              <w:pStyle w:val="Compact"/>
+              <w:jc w:val="left"/>
+            </w:pPr>
+            <w:r>
+              <w:t xml:space="preserve">38.95</w:t>
+            </w:r>
+          </w:p>
+        </w:tc>
+        <w:tc>
+          <w:tcPr/>
+          <w:p>
+            <w:pPr>
+              <w:pStyle w:val="Compact"/>
+              <w:jc w:val="left"/>
+            </w:pPr>
+            <w:r>
+              <w:t xml:space="preserve">106.09</w:t>
             </w:r>
           </w:p>
         </w:tc>
@@ -14836,7 +14836,7 @@
               <w:jc w:val="left"/>
             </w:pPr>
             <w:r>
-              <w:t xml:space="preserve">0.847</w:t>
+              <w:t xml:space="preserve">0.844</w:t>
             </w:r>
           </w:p>
         </w:tc>
@@ -14908,7 +14908,7 @@
               <w:jc w:val="left"/>
             </w:pPr>
             <w:r>
-              <w:t xml:space="preserve">23.28</w:t>
+              <w:t xml:space="preserve">23.30</w:t>
             </w:r>
           </w:p>
         </w:tc>
@@ -14977,7 +14977,7 @@
               <w:jc w:val="left"/>
             </w:pPr>
             <w:r>
-              <w:t xml:space="preserve">24.83</w:t>
+              <w:t xml:space="preserve">24.93</w:t>
             </w:r>
           </w:p>
         </w:tc>
@@ -15001,31 +15001,19 @@
               <w:jc w:val="left"/>
             </w:pPr>
             <w:r>
-              <w:t xml:space="preserve">24.83</w:t>
-            </w:r>
-          </w:p>
-        </w:tc>
-        <w:tc>
-          <w:tcPr/>
-          <w:p>
-            <w:pPr>
-              <w:pStyle w:val="Compact"/>
-              <w:jc w:val="left"/>
-            </w:pPr>
-            <w:r>
-              <w:t xml:space="preserve">24.84</w:t>
-            </w:r>
-          </w:p>
-        </w:tc>
-        <w:tc>
-          <w:tcPr/>
-          <w:p>
-            <w:pPr>
-              <w:pStyle w:val="Compact"/>
-              <w:jc w:val="left"/>
-            </w:pPr>
-            <w:r>
-              <w:t xml:space="preserve">24.88</w:t>
+              <w:t xml:space="preserve">24.94</w:t>
+            </w:r>
+          </w:p>
+        </w:tc>
+        <w:tc>
+          <w:tcPr/>
+          <w:p>
+            <w:pPr>
+              <w:pStyle w:val="Compact"/>
+              <w:jc w:val="left"/>
+            </w:pPr>
+            <w:r>
+              <w:t xml:space="preserve">24.95</w:t>
             </w:r>
           </w:p>
         </w:tc>
@@ -15038,6 +15026,18 @@
             </w:pPr>
             <w:r>
               <w:t xml:space="preserve">24.99</w:t>
+            </w:r>
+          </w:p>
+        </w:tc>
+        <w:tc>
+          <w:tcPr/>
+          <w:p>
+            <w:pPr>
+              <w:pStyle w:val="Compact"/>
+              <w:jc w:val="left"/>
+            </w:pPr>
+            <w:r>
+              <w:t xml:space="preserve">25.11</w:t>
             </w:r>
           </w:p>
         </w:tc>
@@ -15071,7 +15071,7 @@
               <w:jc w:val="left"/>
             </w:pPr>
             <w:r>
-              <w:t xml:space="preserve">0.00–0.33</w:t>
+              <w:t xml:space="preserve">0.00–0.32</w:t>
             </w:r>
           </w:p>
         </w:tc>
@@ -15107,7 +15107,7 @@
                 <w:bCs/>
                 <w:b/>
               </w:rPr>
-              <w:t xml:space="preserve">8.60</w:t>
+              <w:t xml:space="preserve">8.58</w:t>
             </w:r>
           </w:p>
         </w:tc>
@@ -15123,7 +15123,7 @@
                 <w:bCs/>
                 <w:b/>
               </w:rPr>
-              <w:t xml:space="preserve">11.60</w:t>
+              <w:t xml:space="preserve">11.58</w:t>
             </w:r>
           </w:p>
         </w:tc>
@@ -15139,7 +15139,7 @@
                 <w:bCs/>
                 <w:b/>
               </w:rPr>
-              <w:t xml:space="preserve">14.82</w:t>
+              <w:t xml:space="preserve">14.78</w:t>
             </w:r>
           </w:p>
         </w:tc>
@@ -15155,7 +15155,7 @@
                 <w:bCs/>
                 <w:b/>
               </w:rPr>
-              <w:t xml:space="preserve">17.78</w:t>
+              <w:t xml:space="preserve">17.75</w:t>
             </w:r>
           </w:p>
         </w:tc>
@@ -15193,79 +15193,79 @@
               <w:jc w:val="left"/>
             </w:pPr>
             <w:r>
-              <w:t xml:space="preserve">0.435</w:t>
-            </w:r>
-          </w:p>
-        </w:tc>
-        <w:tc>
-          <w:tcPr/>
-          <w:p>
-            <w:pPr>
-              <w:pStyle w:val="Compact"/>
-              <w:jc w:val="left"/>
-            </w:pPr>
-            <w:r>
-              <w:t xml:space="preserve">7.59</w:t>
-            </w:r>
-          </w:p>
-        </w:tc>
-        <w:tc>
-          <w:tcPr/>
-          <w:p>
-            <w:pPr>
-              <w:pStyle w:val="Compact"/>
-              <w:jc w:val="left"/>
-            </w:pPr>
-            <w:r>
-              <w:t xml:space="preserve">0.111</w:t>
-            </w:r>
-          </w:p>
-        </w:tc>
-        <w:tc>
-          <w:tcPr/>
-          <w:p>
-            <w:pPr>
-              <w:pStyle w:val="Compact"/>
-              <w:jc w:val="left"/>
-            </w:pPr>
-            <w:r>
-              <w:t xml:space="preserve">8.71</w:t>
-            </w:r>
-          </w:p>
-        </w:tc>
-        <w:tc>
-          <w:tcPr/>
-          <w:p>
-            <w:pPr>
-              <w:pStyle w:val="Compact"/>
-              <w:jc w:val="left"/>
-            </w:pPr>
-            <w:r>
-              <w:t xml:space="preserve">10.93</w:t>
-            </w:r>
-          </w:p>
-        </w:tc>
-        <w:tc>
-          <w:tcPr/>
-          <w:p>
-            <w:pPr>
-              <w:pStyle w:val="Compact"/>
-              <w:jc w:val="left"/>
-            </w:pPr>
-            <w:r>
-              <w:t xml:space="preserve">18.71</w:t>
-            </w:r>
-          </w:p>
-        </w:tc>
-        <w:tc>
-          <w:tcPr/>
-          <w:p>
-            <w:pPr>
-              <w:pStyle w:val="Compact"/>
-              <w:jc w:val="left"/>
-            </w:pPr>
-            <w:r>
-              <w:t xml:space="preserve">40.95</w:t>
+              <w:t xml:space="preserve">0.437</w:t>
+            </w:r>
+          </w:p>
+        </w:tc>
+        <w:tc>
+          <w:tcPr/>
+          <w:p>
+            <w:pPr>
+              <w:pStyle w:val="Compact"/>
+              <w:jc w:val="left"/>
+            </w:pPr>
+            <w:r>
+              <w:t xml:space="preserve">7.56</w:t>
+            </w:r>
+          </w:p>
+        </w:tc>
+        <w:tc>
+          <w:tcPr/>
+          <w:p>
+            <w:pPr>
+              <w:pStyle w:val="Compact"/>
+              <w:jc w:val="left"/>
+            </w:pPr>
+            <w:r>
+              <w:t xml:space="preserve">0.112</w:t>
+            </w:r>
+          </w:p>
+        </w:tc>
+        <w:tc>
+          <w:tcPr/>
+          <w:p>
+            <w:pPr>
+              <w:pStyle w:val="Compact"/>
+              <w:jc w:val="left"/>
+            </w:pPr>
+            <w:r>
+              <w:t xml:space="preserve">8.68</w:t>
+            </w:r>
+          </w:p>
+        </w:tc>
+        <w:tc>
+          <w:tcPr/>
+          <w:p>
+            <w:pPr>
+              <w:pStyle w:val="Compact"/>
+              <w:jc w:val="left"/>
+            </w:pPr>
+            <w:r>
+              <w:t xml:space="preserve">10.91</w:t>
+            </w:r>
+          </w:p>
+        </w:tc>
+        <w:tc>
+          <w:tcPr/>
+          <w:p>
+            <w:pPr>
+              <w:pStyle w:val="Compact"/>
+              <w:jc w:val="left"/>
+            </w:pPr>
+            <w:r>
+              <w:t xml:space="preserve">18.73</w:t>
+            </w:r>
+          </w:p>
+        </w:tc>
+        <w:tc>
+          <w:tcPr/>
+          <w:p>
+            <w:pPr>
+              <w:pStyle w:val="Compact"/>
+              <w:jc w:val="left"/>
+            </w:pPr>
+            <w:r>
+              <w:t xml:space="preserve">41.07</w:t>
             </w:r>
           </w:p>
         </w:tc>
@@ -15299,79 +15299,79 @@
               <w:jc w:val="left"/>
             </w:pPr>
             <w:r>
-              <w:t xml:space="preserve">0.850</w:t>
-            </w:r>
-          </w:p>
-        </w:tc>
-        <w:tc>
-          <w:tcPr/>
-          <w:p>
-            <w:pPr>
-              <w:pStyle w:val="Compact"/>
-              <w:jc w:val="left"/>
-            </w:pPr>
-            <w:r>
-              <w:t xml:space="preserve">13.25</w:t>
-            </w:r>
-          </w:p>
-        </w:tc>
-        <w:tc>
-          <w:tcPr/>
-          <w:p>
-            <w:pPr>
-              <w:pStyle w:val="Compact"/>
-              <w:jc w:val="left"/>
-            </w:pPr>
-            <w:r>
-              <w:t xml:space="preserve">0.032</w:t>
-            </w:r>
-          </w:p>
-        </w:tc>
-        <w:tc>
-          <w:tcPr/>
-          <w:p>
-            <w:pPr>
-              <w:pStyle w:val="Compact"/>
-              <w:jc w:val="left"/>
-            </w:pPr>
-            <w:r>
-              <w:t xml:space="preserve">13.57</w:t>
-            </w:r>
-          </w:p>
-        </w:tc>
-        <w:tc>
-          <w:tcPr/>
-          <w:p>
-            <w:pPr>
-              <w:pStyle w:val="Compact"/>
-              <w:jc w:val="left"/>
-            </w:pPr>
-            <w:r>
-              <w:t xml:space="preserve">14.21</w:t>
-            </w:r>
-          </w:p>
-        </w:tc>
-        <w:tc>
-          <w:tcPr/>
-          <w:p>
-            <w:pPr>
-              <w:pStyle w:val="Compact"/>
-              <w:jc w:val="left"/>
-            </w:pPr>
-            <w:r>
-              <w:t xml:space="preserve">16.47</w:t>
-            </w:r>
-          </w:p>
-        </w:tc>
-        <w:tc>
-          <w:tcPr/>
-          <w:p>
-            <w:pPr>
-              <w:pStyle w:val="Compact"/>
-              <w:jc w:val="left"/>
-            </w:pPr>
-            <w:r>
-              <w:t xml:space="preserve">22.90</w:t>
+              <w:t xml:space="preserve">0.853</w:t>
+            </w:r>
+          </w:p>
+        </w:tc>
+        <w:tc>
+          <w:tcPr/>
+          <w:p>
+            <w:pPr>
+              <w:pStyle w:val="Compact"/>
+              <w:jc w:val="left"/>
+            </w:pPr>
+            <w:r>
+              <w:t xml:space="preserve">13.35</w:t>
+            </w:r>
+          </w:p>
+        </w:tc>
+        <w:tc>
+          <w:tcPr/>
+          <w:p>
+            <w:pPr>
+              <w:pStyle w:val="Compact"/>
+              <w:jc w:val="left"/>
+            </w:pPr>
+            <w:r>
+              <w:t xml:space="preserve">0.033</w:t>
+            </w:r>
+          </w:p>
+        </w:tc>
+        <w:tc>
+          <w:tcPr/>
+          <w:p>
+            <w:pPr>
+              <w:pStyle w:val="Compact"/>
+              <w:jc w:val="left"/>
+            </w:pPr>
+            <w:r>
+              <w:t xml:space="preserve">13.68</w:t>
+            </w:r>
+          </w:p>
+        </w:tc>
+        <w:tc>
+          <w:tcPr/>
+          <w:p>
+            <w:pPr>
+              <w:pStyle w:val="Compact"/>
+              <w:jc w:val="left"/>
+            </w:pPr>
+            <w:r>
+              <w:t xml:space="preserve">14.33</w:t>
+            </w:r>
+          </w:p>
+        </w:tc>
+        <w:tc>
+          <w:tcPr/>
+          <w:p>
+            <w:pPr>
+              <w:pStyle w:val="Compact"/>
+              <w:jc w:val="left"/>
+            </w:pPr>
+            <w:r>
+              <w:t xml:space="preserve">16.62</w:t>
+            </w:r>
+          </w:p>
+        </w:tc>
+        <w:tc>
+          <w:tcPr/>
+          <w:p>
+            <w:pPr>
+              <w:pStyle w:val="Compact"/>
+              <w:jc w:val="left"/>
+            </w:pPr>
+            <w:r>
+              <w:t xml:space="preserve">23.16</w:t>
             </w:r>
           </w:p>
         </w:tc>
@@ -15440,31 +15440,31 @@
               <w:jc w:val="left"/>
             </w:pPr>
             <w:r>
-              <w:t xml:space="preserve">15.12</w:t>
-            </w:r>
-          </w:p>
-        </w:tc>
-        <w:tc>
-          <w:tcPr/>
-          <w:p>
-            <w:pPr>
-              <w:pStyle w:val="Compact"/>
-              <w:jc w:val="left"/>
-            </w:pPr>
-            <w:r>
-              <w:t xml:space="preserve">0.025</w:t>
-            </w:r>
-          </w:p>
-        </w:tc>
-        <w:tc>
-          <w:tcPr/>
-          <w:p>
-            <w:pPr>
-              <w:pStyle w:val="Compact"/>
-              <w:jc w:val="left"/>
-            </w:pPr>
-            <w:r>
-              <w:t xml:space="preserve">15.37</w:t>
+              <w:t xml:space="preserve">15.10</w:t>
+            </w:r>
+          </w:p>
+        </w:tc>
+        <w:tc>
+          <w:tcPr/>
+          <w:p>
+            <w:pPr>
+              <w:pStyle w:val="Compact"/>
+              <w:jc w:val="left"/>
+            </w:pPr>
+            <w:r>
+              <w:t xml:space="preserve">0.026</w:t>
+            </w:r>
+          </w:p>
+        </w:tc>
+        <w:tc>
+          <w:tcPr/>
+          <w:p>
+            <w:pPr>
+              <w:pStyle w:val="Compact"/>
+              <w:jc w:val="left"/>
+            </w:pPr>
+            <w:r>
+              <w:t xml:space="preserve">15.36</w:t>
             </w:r>
           </w:p>
         </w:tc>
@@ -15488,19 +15488,19 @@
               <w:jc w:val="left"/>
             </w:pPr>
             <w:r>
-              <w:t xml:space="preserve">17.63</w:t>
-            </w:r>
-          </w:p>
-        </w:tc>
-        <w:tc>
-          <w:tcPr/>
-          <w:p>
-            <w:pPr>
-              <w:pStyle w:val="Compact"/>
-              <w:jc w:val="left"/>
-            </w:pPr>
-            <w:r>
-              <w:t xml:space="preserve">22.65</w:t>
+              <w:t xml:space="preserve">17.69</w:t>
+            </w:r>
+          </w:p>
+        </w:tc>
+        <w:tc>
+          <w:tcPr/>
+          <w:p>
+            <w:pPr>
+              <w:pStyle w:val="Compact"/>
+              <w:jc w:val="left"/>
+            </w:pPr>
+            <w:r>
+              <w:t xml:space="preserve">22.87</w:t>
             </w:r>
           </w:p>
         </w:tc>
@@ -15534,19 +15534,19 @@
               <w:jc w:val="left"/>
             </w:pPr>
             <w:r>
-              <w:t xml:space="preserve">0.21–0.88</w:t>
-            </w:r>
-          </w:p>
-        </w:tc>
-        <w:tc>
-          <w:tcPr/>
-          <w:p>
-            <w:pPr>
-              <w:pStyle w:val="Compact"/>
-              <w:jc w:val="left"/>
-            </w:pPr>
-            <w:r>
-              <w:t xml:space="preserve">4.5–14.3</w:t>
+              <w:t xml:space="preserve">0.21–0.89</w:t>
+            </w:r>
+          </w:p>
+        </w:tc>
+        <w:tc>
+          <w:tcPr/>
+          <w:p>
+            <w:pPr>
+              <w:pStyle w:val="Compact"/>
+              <w:jc w:val="left"/>
+            </w:pPr>
+            <w:r>
+              <w:t xml:space="preserve">4.6–14.4</w:t>
             </w:r>
           </w:p>
         </w:tc>
@@ -15570,7 +15570,7 @@
                 <w:bCs/>
                 <w:b/>
               </w:rPr>
-              <w:t xml:space="preserve">7.05</w:t>
+              <w:t xml:space="preserve">7.15</w:t>
             </w:r>
           </w:p>
         </w:tc>
@@ -15586,7 +15586,7 @@
                 <w:bCs/>
                 <w:b/>
               </w:rPr>
-              <w:t xml:space="preserve">10.26</w:t>
+              <w:t xml:space="preserve">10.31</w:t>
             </w:r>
           </w:p>
         </w:tc>
@@ -15602,7 +15602,7 @@
                 <w:bCs/>
                 <w:b/>
               </w:rPr>
-              <w:t xml:space="preserve">14.99</w:t>
+              <w:t xml:space="preserve">15.21</w:t>
             </w:r>
           </w:p>
         </w:tc>
@@ -15618,7 +15618,7 @@
                 <w:bCs/>
                 <w:b/>
               </w:rPr>
-              <w:t xml:space="preserve">21.57</w:t>
+              <w:t xml:space="preserve">21.90</w:t>
             </w:r>
           </w:p>
         </w:tc>
@@ -15860,7 +15860,7 @@
         <w:t xml:space="preserve"> </w:t>
       </w:r>
       <w:r>
-        <w:t xml:space="preserve">(R1), 57 (R2) and 88 (R3); with the per-operation results of Experiment A1 the break-even values are 31–35 (RTK) and 88–117 (DGPS). Second, the cost-optimal margin under RTK accepts frequent but tiny misses: even at</w:t>
+        <w:t xml:space="preserve">(R1), 58 (R2) and 88 (R3); with the per-operation results of Experiment A1 the break-even values are 31–35 (RTK) and 88–117 (DGPS). Second, the cost-optimal margin under RTK accepts frequent but tiny misses: even at</w:t>
       </w:r>
       <w:r>
         <w:t xml:space="preserve"> </w:t>
@@ -15883,7 +15883,7 @@
         <w:t xml:space="preserve"> </w:t>
       </w:r>
       <w:r>
-        <w:t xml:space="preserve">it has a P(no miss) of only 0.49 (R1) and 0.33 (R2), because RTK misses are slivers of 0.004–0.03% of the area. Only under DGPS, whose misses are wider, does the cost-optimal margin approach the 0.9 level (</w:t>
+        <w:t xml:space="preserve">it has a P(no miss) of only 0.50 (R1) and 0.32 (R2), because RTK misses are slivers of 0.004–0.03% of the area. Only under DGPS, whose misses are wider, does the cost-optimal margin approach the 0.9 level (</w:t>
       </w:r>
       <m:oMath>
         <m:r>
@@ -15900,7 +15900,7 @@
         </m:r>
       </m:oMath>
       <w:r>
-        <w:t xml:space="preserve">: 0.88). Third, a tolerance helps where implements are narrow: certifying</w:t>
+        <w:t xml:space="preserve">: 0.89). Third, a tolerance helps where implements are narrow: certifying</w:t>
       </w:r>
       <w:r>
         <w:t xml:space="preserve"> </w:t>
@@ -15936,7 +15936,7 @@
         <w:t xml:space="preserve"> </w:t>
       </w:r>
       <w:r>
-        <w:t xml:space="preserve">lowers the margin by 1 cm and saves 0.9, 2.0 and 0.5 pp of overlap in R1–R3, and a 5 cm tolerance saves 2.0, 5.0 and 1.1 pp.</w:t>
+        <w:t xml:space="preserve">lowers the margin by 1 cm and saves 0.9, 2.0 and 0.4 pp of overlap in R1–R3, and a 5 cm tolerance saves 2.0, 5.0 and 1.1 pp.</w:t>
       </w:r>
     </w:p>
     <w:p>

</xml_diff>